<commit_message>
Facilitadores de recorrido y DOI de Zenodo (Ruta 2: 10.5281/zenodo.23642554; Grupo 21: 10.5281/zenodo.23642556)
Co-Authored-By: Claude Opus 5.5 <noreply@anthropic.com>
</commit_message>
<xml_diff>
--- a/itinerarios/2026-ruta-1-itinerario.docx
+++ b/itinerarios/2026-ruta-1-itinerario.docx
@@ -128,6 +128,18 @@
           <w:sz w:val="20"/>
         </w:rPr>
         <w:t>Sábado 14 de noviembre de 2026 · Salida 07:30 del Centro Académico Regional (CAR), Huatusco, Veracruz · Recorrido de un día, cerca de 82 km más el regreso</w:t>
+      </w:r>
+    </w:p>
+    <w:p>
+      <w:pPr>
+        <w:spacing w:after="40"/>
+      </w:pPr>
+      <w:r>
+        <w:rPr>
+          <w:b/>
+          <w:sz w:val="20"/>
+        </w:rPr>
+        <w:t>Facilitador del recorrido: Dr. Héctor Tecumshé Mojica Zárate</w:t>
       </w:r>
     </w:p>
     <w:p>

</xml_diff>

<commit_message>
Ruta 1: logotipo de la Universidad Autónoma Chapingo en la portada y en el itinerario
Co-Authored-By: Claude Opus 5.5 <noreply@anthropic.com>
</commit_message>
<xml_diff>
--- a/itinerarios/2026-ruta-1-itinerario.docx
+++ b/itinerarios/2026-ruta-1-itinerario.docx
@@ -9,8 +9,9 @@
         <w:tblLook w:firstColumn="1" w:firstRow="1" w:lastColumn="0" w:lastRow="0" w:noHBand="0" w:noVBand="1" w:val="04A0"/>
       </w:tblPr>
       <w:tblGrid>
-        <w:gridCol w:w="7013"/>
-        <w:gridCol w:w="7013"/>
+        <w:gridCol w:w="4675"/>
+        <w:gridCol w:w="4675"/>
+        <w:gridCol w:w="4675"/>
       </w:tblGrid>
       <w:tr>
         <w:tc>
@@ -56,7 +57,48 @@
         </w:tc>
         <w:tc>
           <w:tcPr>
-            <w:tcW w:type="dxa" w:w="12189"/>
+            <w:tcW w:type="dxa" w:w="1474"/>
+          </w:tcPr>
+          <w:p>
+            <w:r>
+              <w:drawing>
+                <wp:inline xmlns:a="http://schemas.openxmlformats.org/drawingml/2006/main" xmlns:pic="http://schemas.openxmlformats.org/drawingml/2006/picture">
+                  <wp:extent cx="830389" cy="864000"/>
+                  <wp:docPr id="2" name="Picture 2"/>
+                  <wp:cNvGraphicFramePr>
+                    <a:graphicFrameLocks noChangeAspect="1"/>
+                  </wp:cNvGraphicFramePr>
+                  <a:graphic>
+                    <a:graphicData uri="http://schemas.openxmlformats.org/drawingml/2006/picture">
+                      <pic:pic>
+                        <pic:nvPicPr>
+                          <pic:cNvPr id="0" name="logo_uach_web.jpg"/>
+                          <pic:cNvPicPr/>
+                        </pic:nvPicPr>
+                        <pic:blipFill>
+                          <a:blip r:embed="rId10"/>
+                          <a:stretch>
+                            <a:fillRect/>
+                          </a:stretch>
+                        </pic:blipFill>
+                        <pic:spPr>
+                          <a:xfrm>
+                            <a:off x="0" y="0"/>
+                            <a:ext cx="830389" cy="864000"/>
+                          </a:xfrm>
+                          <a:prstGeom prst="rect"/>
+                        </pic:spPr>
+                      </pic:pic>
+                    </a:graphicData>
+                  </a:graphic>
+                </wp:inline>
+              </w:drawing>
+            </w:r>
+          </w:p>
+        </w:tc>
+        <w:tc>
+          <w:tcPr>
+            <w:tcW w:type="dxa" w:w="10715"/>
             <w:vAlign w:val="center"/>
           </w:tcPr>
           <w:p>
@@ -162,7 +204,7 @@
         <w:drawing>
           <wp:inline xmlns:a="http://schemas.openxmlformats.org/drawingml/2006/main" xmlns:pic="http://schemas.openxmlformats.org/drawingml/2006/picture">
             <wp:extent cx="4860000" cy="2612250"/>
-            <wp:docPr id="2" name="Picture 2"/>
+            <wp:docPr id="3" name="Picture 3"/>
             <wp:cNvGraphicFramePr>
               <a:graphicFrameLocks noChangeAspect="1"/>
             </wp:cNvGraphicFramePr>
@@ -174,7 +216,7 @@
                     <pic:cNvPicPr/>
                   </pic:nvPicPr>
                   <pic:blipFill>
-                    <a:blip r:embed="rId10"/>
+                    <a:blip r:embed="rId11"/>
                     <a:stretch>
                       <a:fillRect/>
                     </a:stretch>
@@ -2169,7 +2211,7 @@
         <w:drawing>
           <wp:inline xmlns:a="http://schemas.openxmlformats.org/drawingml/2006/main" xmlns:pic="http://schemas.openxmlformats.org/drawingml/2006/picture">
             <wp:extent cx="5580000" cy="3138750"/>
-            <wp:docPr id="3" name="Picture 3"/>
+            <wp:docPr id="4" name="Picture 4"/>
             <wp:cNvGraphicFramePr>
               <a:graphicFrameLocks noChangeAspect="1"/>
             </wp:cNvGraphicFramePr>
@@ -2181,7 +2223,7 @@
                     <pic:cNvPicPr/>
                   </pic:nvPicPr>
                   <pic:blipFill>
-                    <a:blip r:embed="rId11"/>
+                    <a:blip r:embed="rId12"/>
                     <a:stretch>
                       <a:fillRect/>
                     </a:stretch>
@@ -2221,7 +2263,7 @@
         <w:drawing>
           <wp:inline xmlns:a="http://schemas.openxmlformats.org/drawingml/2006/main" xmlns:pic="http://schemas.openxmlformats.org/drawingml/2006/picture">
             <wp:extent cx="7020000" cy="2193750"/>
-            <wp:docPr id="4" name="Picture 4"/>
+            <wp:docPr id="5" name="Picture 5"/>
             <wp:cNvGraphicFramePr>
               <a:graphicFrameLocks noChangeAspect="1"/>
             </wp:cNvGraphicFramePr>
@@ -2233,7 +2275,7 @@
                     <pic:cNvPicPr/>
                   </pic:nvPicPr>
                   <pic:blipFill>
-                    <a:blip r:embed="rId12"/>
+                    <a:blip r:embed="rId13"/>
                     <a:stretch>
                       <a:fillRect/>
                     </a:stretch>
@@ -5569,7 +5611,7 @@
               <w:drawing>
                 <wp:inline xmlns:a="http://schemas.openxmlformats.org/drawingml/2006/main" xmlns:pic="http://schemas.openxmlformats.org/drawingml/2006/picture">
                   <wp:extent cx="1224000" cy="1224000"/>
-                  <wp:docPr id="5" name="Picture 5"/>
+                  <wp:docPr id="6" name="Picture 6"/>
                   <wp:cNvGraphicFramePr>
                     <a:graphicFrameLocks noChangeAspect="1"/>
                   </wp:cNvGraphicFramePr>
@@ -5581,7 +5623,7 @@
                           <pic:cNvPicPr/>
                         </pic:nvPicPr>
                         <pic:blipFill>
-                          <a:blip r:embed="rId13"/>
+                          <a:blip r:embed="rId14"/>
                           <a:stretch>
                             <a:fillRect/>
                           </a:stretch>
@@ -5628,7 +5670,7 @@
               <w:drawing>
                 <wp:inline xmlns:a="http://schemas.openxmlformats.org/drawingml/2006/main" xmlns:pic="http://schemas.openxmlformats.org/drawingml/2006/picture">
                   <wp:extent cx="1224000" cy="1224000"/>
-                  <wp:docPr id="6" name="Picture 6"/>
+                  <wp:docPr id="7" name="Picture 7"/>
                   <wp:cNvGraphicFramePr>
                     <a:graphicFrameLocks noChangeAspect="1"/>
                   </wp:cNvGraphicFramePr>
@@ -5640,7 +5682,7 @@
                           <pic:cNvPicPr/>
                         </pic:nvPicPr>
                         <pic:blipFill>
-                          <a:blip r:embed="rId14"/>
+                          <a:blip r:embed="rId15"/>
                           <a:stretch>
                             <a:fillRect/>
                           </a:stretch>

</xml_diff>